<commit_message>
Print the PM's email on the letter, from the register's PmEmail column
The email in the letterhead and under the sign-off came from the office's
letterhead register. Both now come from a new PM email field in step 6,
filled from the project register's PmEmail column or typed in; the office
email stands in only when a project has none. One of the two is required,
in place of the office email.

The PM email goes to the log write and the filing flow as pmEmail, and
travels in the saved form, so the log, a reopened variation and the
variation file all keep it. It can be matched in Settings like the other
register columns. The registers, the Get projects Select step and the log
column list document it.

Co-Authored-By: Claude Opus 5.5 <noreply@anthropic.com>
Claude-Session: https://claude.ai/code/session_0179JD8tKBuQw572uHNzHE2b
</commit_message>
<xml_diff>
--- a/docs/word/2 - The Two Registers.docx
+++ b/docs/word/2 - The Two Registers.docx
@@ -3193,6 +3193,133 @@
                 <w:sz w:val="18"/>
                 <w:szCs w:val="18"/>
               </w:rPr>
+              <w:t xml:space="preserve">PM Email</w:t>
+            </w:r>
+          </w:p>
+        </w:tc>
+        <w:tc>
+          <w:tcPr>
+            <w:tcW w:type="dxa" w:w="1160"/>
+            <w:shd w:fill="FFFFFF" w:val="clear"/>
+            <w:tcMar>
+              <w:top w:type="dxa" w:w="60"/>
+              <w:left w:type="dxa" w:w="110"/>
+              <w:bottom w:type="dxa" w:w="60"/>
+              <w:right w:type="dxa" w:w="110"/>
+            </w:tcMar>
+          </w:tcPr>
+          <w:p>
+            <w:pPr>
+              <w:spacing w:after="0" w:before="0"/>
+            </w:pPr>
+            <w:r>
+              <w:rPr>
+                <w:rFonts w:ascii="Consolas" w:cs="Consolas" w:eastAsia="Consolas" w:hAnsi="Consolas"/>
+                <w:color w:val="2A4258"/>
+                <w:sz w:val="16"/>
+                <w:szCs w:val="16"/>
+                <w:shd w:fill="F2F0EA" w:val="clear"/>
+              </w:rPr>
+              <w:t xml:space="preserve">PmEmail</w:t>
+            </w:r>
+          </w:p>
+        </w:tc>
+        <w:tc>
+          <w:tcPr>
+            <w:tcW w:type="dxa" w:w="2901"/>
+            <w:shd w:fill="FFFFFF" w:val="clear"/>
+            <w:tcMar>
+              <w:top w:type="dxa" w:w="60"/>
+              <w:left w:type="dxa" w:w="110"/>
+              <w:bottom w:type="dxa" w:w="60"/>
+              <w:right w:type="dxa" w:w="110"/>
+            </w:tcMar>
+          </w:tcPr>
+          <w:p>
+            <w:pPr>
+              <w:spacing w:after="0" w:before="0"/>
+            </w:pPr>
+            <w:r>
+              <w:rPr>
+                <w:rFonts w:ascii="Arial" w:cs="Arial" w:eastAsia="Arial" w:hAnsi="Arial"/>
+                <w:color w:val="1C2B3A"/>
+                <w:sz w:val="18"/>
+                <w:szCs w:val="18"/>
+              </w:rPr>
+              <w:t xml:space="preserve">Single line of text</w:t>
+            </w:r>
+          </w:p>
+        </w:tc>
+        <w:tc>
+          <w:tcPr>
+            <w:tcW w:type="dxa" w:w="3869"/>
+            <w:shd w:fill="FFFFFF" w:val="clear"/>
+            <w:tcMar>
+              <w:top w:type="dxa" w:w="60"/>
+              <w:left w:type="dxa" w:w="110"/>
+              <w:bottom w:type="dxa" w:w="60"/>
+              <w:right w:type="dxa" w:w="110"/>
+            </w:tcMar>
+          </w:tcPr>
+          <w:p>
+            <w:pPr>
+              <w:spacing w:after="0" w:before="0"/>
+            </w:pPr>
+            <w:r>
+              <w:rPr>
+                <w:rFonts w:ascii="Arial" w:cs="Arial" w:eastAsia="Arial" w:hAnsi="Arial"/>
+                <w:color w:val="1C2B3A"/>
+                <w:sz w:val="18"/>
+                <w:szCs w:val="18"/>
+              </w:rPr>
+              <w:t xml:space="preserve">Fills </w:t>
+            </w:r>
+            <w:r>
+              <w:rPr>
+                <w:rFonts w:ascii="Arial" w:cs="Arial" w:eastAsia="Arial" w:hAnsi="Arial"/>
+                <w:i/>
+                <w:iCs/>
+                <w:color w:val="1C2B3A"/>
+                <w:sz w:val="18"/>
+                <w:szCs w:val="18"/>
+              </w:rPr>
+              <w:t xml:space="preserve">PM email</w:t>
+            </w:r>
+            <w:r>
+              <w:rPr>
+                <w:rFonts w:ascii="Arial" w:cs="Arial" w:eastAsia="Arial" w:hAnsi="Arial"/>
+                <w:color w:val="1C2B3A"/>
+                <w:sz w:val="18"/>
+                <w:szCs w:val="18"/>
+              </w:rPr>
+              <w:t xml:space="preserve"> — the email printed in the letterhead and under the sign-off</w:t>
+            </w:r>
+          </w:p>
+        </w:tc>
+      </w:tr>
+      <w:tr>
+        <w:tc>
+          <w:tcPr>
+            <w:tcW w:type="dxa" w:w="1096"/>
+            <w:shd w:fill="FFFFFF" w:val="clear"/>
+            <w:tcMar>
+              <w:top w:type="dxa" w:w="60"/>
+              <w:left w:type="dxa" w:w="110"/>
+              <w:bottom w:type="dxa" w:w="60"/>
+              <w:right w:type="dxa" w:w="110"/>
+            </w:tcMar>
+          </w:tcPr>
+          <w:p>
+            <w:pPr>
+              <w:spacing w:after="0" w:before="0"/>
+            </w:pPr>
+            <w:r>
+              <w:rPr>
+                <w:rFonts w:ascii="Arial" w:cs="Arial" w:eastAsia="Arial" w:hAnsi="Arial"/>
+                <w:color w:val="1C2B3A"/>
+                <w:sz w:val="18"/>
+                <w:szCs w:val="18"/>
+              </w:rPr>
               <w:t xml:space="preserve">Folder Path</w:t>
             </w:r>
           </w:p>
@@ -4317,6 +4444,25 @@
           <w:szCs w:val="18"/>
           <w:shd w:fill="F2F0EA" w:val="clear"/>
         </w:rPr>
+        <w:t xml:space="preserve">PmEmail</w:t>
+      </w:r>
+      <w:r>
+        <w:rPr>
+          <w:rFonts w:ascii="Arial" w:cs="Arial" w:eastAsia="Arial" w:hAnsi="Arial"/>
+          <w:color w:val="1C2B3A"/>
+          <w:sz w:val="20"/>
+          <w:szCs w:val="20"/>
+        </w:rPr>
+        <w:t xml:space="preserve"> → PM Email · </w:t>
+      </w:r>
+      <w:r>
+        <w:rPr>
+          <w:rFonts w:ascii="Consolas" w:cs="Consolas" w:eastAsia="Consolas" w:hAnsi="Consolas"/>
+          <w:color w:val="2A4258"/>
+          <w:sz w:val="18"/>
+          <w:szCs w:val="18"/>
+          <w:shd w:fill="F2F0EA" w:val="clear"/>
+        </w:rPr>
         <w:t xml:space="preserve">FolderPath</w:t>
       </w:r>
       <w:r>
@@ -7658,7 +7804,7 @@
       </w:r>
     </w:p>
     <w:sectPr>
-      <w:footerReference w:type="default" r:id="rId7"/>
+      <w:footerReference w:type="default" r:id="rId6"/>
       <w:pgSz w:w="11906" w:h="16838" w:orient="portrait"/>
       <w:pgMar w:top="1440" w:right="1440" w:bottom="1440" w:left="1440" w:header="708" w:footer="708" w:gutter="0"/>
       <w:pgNumType/>
@@ -7666,10 +7812,6 @@
     </w:sectPr>
   </w:body>
 </w:document>
-</file>
-
-<file path=word/comments.xml><?xml version="1.0" encoding="utf-8"?>
-<w:comments xmlns:cx="http://schemas.microsoft.com/office/drawing/2014/chartex" xmlns:cx1="http://schemas.microsoft.com/office/drawing/2015/9/8/chartex" xmlns:cx2="http://schemas.microsoft.com/office/drawing/2015/10/21/chartex" xmlns:cx3="http://schemas.microsoft.com/office/drawing/2016/5/9/chartex" xmlns:cx4="http://schemas.microsoft.com/office/drawing/2016/5/10/chartex" xmlns:cx5="http://schemas.microsoft.com/office/drawing/2016/5/11/chartex" xmlns:cx6="http://schemas.microsoft.com/office/drawing/2016/5/12/chartex" xmlns:cx7="http://schemas.microsoft.com/office/drawing/2016/5/13/chartex" xmlns:cx8="http://schemas.microsoft.com/office/drawing/2016/5/14/chartex" xmlns:mc="http://schemas.openxmlformats.org/markup-compatibility/2006" xmlns:aink="http://schemas.microsoft.com/office/drawing/2016/ink" xmlns:am3d="http://schemas.microsoft.com/office/drawing/2017/model3d" xmlns:o="urn:schemas-microsoft-com:office:office" xmlns:r="http://schemas.openxmlformats.org/officeDocument/2006/relationships" xmlns:m="http://schemas.openxmlformats.org/officeDocument/2006/math" xmlns:v="urn:schemas-microsoft-com:vml" xmlns:wp14="http://schemas.microsoft.com/office/word/2010/wordprocessingDrawing" xmlns:wp="http://schemas.openxmlformats.org/drawingml/2006/wordprocessingDrawing" xmlns:w10="urn:schemas-microsoft-com:office:word" xmlns:w="http://schemas.openxmlformats.org/wordprocessingml/2006/main" xmlns:w14="http://schemas.microsoft.com/office/word/2010/wordml" xmlns:w15="http://schemas.microsoft.com/office/word/2012/wordml" xmlns:w16cex="http://schemas.microsoft.com/office/word/2018/wordml/cex" xmlns:w16cid="http://schemas.microsoft.com/office/word/2016/wordml/cid" xmlns:w16="http://schemas.microsoft.com/office/word/2018/wordml" xmlns:w16sdtdh="http://schemas.microsoft.com/office/word/2020/wordml/sdtdatahash" xmlns:w16se="http://schemas.microsoft.com/office/word/2015/wordml/symex" xmlns:wpg="http://schemas.microsoft.com/office/word/2010/wordprocessingGroup" xmlns:wpi="http://schemas.microsoft.com/office/word/2010/wordprocessingInk" xmlns:wne="http://schemas.microsoft.com/office/word/2006/wordml" xmlns:wps="http://schemas.microsoft.com/office/word/2010/wordprocessingShape"/>
 </file>
 
 <file path=word/endnotes.xml><?xml version="1.0" encoding="utf-8"?>
@@ -7723,14 +7865,86 @@
         <w:szCs w:val="16"/>
       </w:rPr>
       <w:t xml:space="preserve">2 - The Two Registers    |    Page </w:t>
+    </w:r>
+    <w:r>
+      <w:rPr>
+        <w:rFonts w:ascii="Arial" w:cs="Arial" w:eastAsia="Arial" w:hAnsi="Arial"/>
+        <w:color w:val="6B6459"/>
+        <w:sz w:val="16"/>
+        <w:szCs w:val="16"/>
+      </w:rPr>
       <w:fldChar w:fldCharType="begin"/>
+    </w:r>
+    <w:r>
+      <w:rPr>
+        <w:rFonts w:ascii="Arial" w:cs="Arial" w:eastAsia="Arial" w:hAnsi="Arial"/>
+        <w:color w:val="6B6459"/>
+        <w:sz w:val="16"/>
+        <w:szCs w:val="16"/>
+      </w:rPr>
       <w:instrText xml:space="preserve">PAGE</w:instrText>
+    </w:r>
+    <w:r>
+      <w:rPr>
+        <w:rFonts w:ascii="Arial" w:cs="Arial" w:eastAsia="Arial" w:hAnsi="Arial"/>
+        <w:color w:val="6B6459"/>
+        <w:sz w:val="16"/>
+        <w:szCs w:val="16"/>
+      </w:rPr>
       <w:fldChar w:fldCharType="separate"/>
+    </w:r>
+    <w:r>
+      <w:rPr>
+        <w:rFonts w:ascii="Arial" w:cs="Arial" w:eastAsia="Arial" w:hAnsi="Arial"/>
+        <w:color w:val="6B6459"/>
+        <w:sz w:val="16"/>
+        <w:szCs w:val="16"/>
+      </w:rPr>
       <w:fldChar w:fldCharType="end"/>
+    </w:r>
+    <w:r>
+      <w:rPr>
+        <w:rFonts w:ascii="Arial" w:cs="Arial" w:eastAsia="Arial" w:hAnsi="Arial"/>
+        <w:color w:val="6B6459"/>
+        <w:sz w:val="16"/>
+        <w:szCs w:val="16"/>
+      </w:rPr>
       <w:t xml:space="preserve"> of </w:t>
+    </w:r>
+    <w:r>
+      <w:rPr>
+        <w:rFonts w:ascii="Arial" w:cs="Arial" w:eastAsia="Arial" w:hAnsi="Arial"/>
+        <w:color w:val="6B6459"/>
+        <w:sz w:val="16"/>
+        <w:szCs w:val="16"/>
+      </w:rPr>
       <w:fldChar w:fldCharType="begin"/>
+    </w:r>
+    <w:r>
+      <w:rPr>
+        <w:rFonts w:ascii="Arial" w:cs="Arial" w:eastAsia="Arial" w:hAnsi="Arial"/>
+        <w:color w:val="6B6459"/>
+        <w:sz w:val="16"/>
+        <w:szCs w:val="16"/>
+      </w:rPr>
       <w:instrText xml:space="preserve">NUMPAGES</w:instrText>
+    </w:r>
+    <w:r>
+      <w:rPr>
+        <w:rFonts w:ascii="Arial" w:cs="Arial" w:eastAsia="Arial" w:hAnsi="Arial"/>
+        <w:color w:val="6B6459"/>
+        <w:sz w:val="16"/>
+        <w:szCs w:val="16"/>
+      </w:rPr>
       <w:fldChar w:fldCharType="separate"/>
+    </w:r>
+    <w:r>
+      <w:rPr>
+        <w:rFonts w:ascii="Arial" w:cs="Arial" w:eastAsia="Arial" w:hAnsi="Arial"/>
+        <w:color w:val="6B6459"/>
+        <w:sz w:val="16"/>
+        <w:szCs w:val="16"/>
+      </w:rPr>
       <w:fldChar w:fldCharType="end"/>
     </w:r>
   </w:p>
@@ -7778,7 +7992,7 @@
 <w:numbering xmlns:wpc="http://schemas.microsoft.com/office/word/2010/wordprocessingCanvas" xmlns:mc="http://schemas.openxmlformats.org/markup-compatibility/2006" xmlns:o="urn:schemas-microsoft-com:office:office" xmlns:r="http://schemas.openxmlformats.org/officeDocument/2006/relationships" xmlns:m="http://schemas.openxmlformats.org/officeDocument/2006/math" xmlns:v="urn:schemas-microsoft-com:vml" xmlns:wp14="http://schemas.microsoft.com/office/word/2010/wordprocessingDrawing" xmlns:wp="http://schemas.openxmlformats.org/drawingml/2006/wordprocessingDrawing" xmlns:w10="urn:schemas-microsoft-com:office:word" xmlns:w="http://schemas.openxmlformats.org/wordprocessingml/2006/main" xmlns:w14="http://schemas.microsoft.com/office/word/2010/wordml" xmlns:w15="http://schemas.microsoft.com/office/word/2012/wordml" xmlns:wpg="http://schemas.microsoft.com/office/word/2010/wordprocessingGroup" xmlns:wpi="http://schemas.microsoft.com/office/word/2010/wordprocessingInk" xmlns:wne="http://schemas.microsoft.com/office/word/2006/wordml" xmlns:wps="http://schemas.microsoft.com/office/word/2010/wordprocessingShape" mc:Ignorable="w14 w15 wp14">
   <w:abstractNum w:abstractNumId="1" w15:restartNumberingAfterBreak="0">
     <w:multiLevelType w:val="hybridMultilevel"/>
-    <w:lvl w:ilvl="0" w15:tentative="1">
+    <w:lvl w:ilvl="0" w:tentative="1">
       <w:start w:val="1"/>
       <w:numFmt w:val="bullet"/>
       <w:lvlText w:val="●"/>
@@ -7787,7 +8001,7 @@
         <w:ind w:left="720" w:hanging="360"/>
       </w:pPr>
     </w:lvl>
-    <w:lvl w:ilvl="1" w15:tentative="1">
+    <w:lvl w:ilvl="1" w:tentative="1">
       <w:start w:val="1"/>
       <w:numFmt w:val="bullet"/>
       <w:lvlText w:val="○"/>
@@ -7796,7 +8010,7 @@
         <w:ind w:left="1440" w:hanging="360"/>
       </w:pPr>
     </w:lvl>
-    <w:lvl w:ilvl="2" w15:tentative="1">
+    <w:lvl w:ilvl="2" w:tentative="1">
       <w:start w:val="1"/>
       <w:numFmt w:val="bullet"/>
       <w:lvlText w:val="■"/>
@@ -7805,7 +8019,7 @@
         <w:ind w:left="2160" w:hanging="360"/>
       </w:pPr>
     </w:lvl>
-    <w:lvl w:ilvl="3" w15:tentative="1">
+    <w:lvl w:ilvl="3" w:tentative="1">
       <w:start w:val="1"/>
       <w:numFmt w:val="bullet"/>
       <w:lvlText w:val="●"/>
@@ -7814,7 +8028,7 @@
         <w:ind w:left="2880" w:hanging="360"/>
       </w:pPr>
     </w:lvl>
-    <w:lvl w:ilvl="4" w15:tentative="1">
+    <w:lvl w:ilvl="4" w:tentative="1">
       <w:start w:val="1"/>
       <w:numFmt w:val="bullet"/>
       <w:lvlText w:val="○"/>
@@ -7823,7 +8037,7 @@
         <w:ind w:left="3600" w:hanging="360"/>
       </w:pPr>
     </w:lvl>
-    <w:lvl w:ilvl="5" w15:tentative="1">
+    <w:lvl w:ilvl="5" w:tentative="1">
       <w:start w:val="1"/>
       <w:numFmt w:val="bullet"/>
       <w:lvlText w:val="■"/>
@@ -7832,7 +8046,7 @@
         <w:ind w:left="4320" w:hanging="360"/>
       </w:pPr>
     </w:lvl>
-    <w:lvl w:ilvl="6" w15:tentative="1">
+    <w:lvl w:ilvl="6" w:tentative="1">
       <w:start w:val="1"/>
       <w:numFmt w:val="bullet"/>
       <w:lvlText w:val="●"/>
@@ -7841,7 +8055,7 @@
         <w:ind w:left="5040" w:hanging="360"/>
       </w:pPr>
     </w:lvl>
-    <w:lvl w:ilvl="7" w15:tentative="1">
+    <w:lvl w:ilvl="7" w:tentative="1">
       <w:start w:val="1"/>
       <w:numFmt w:val="bullet"/>
       <w:lvlText w:val="●"/>
@@ -7850,7 +8064,7 @@
         <w:ind w:left="5760" w:hanging="360"/>
       </w:pPr>
     </w:lvl>
-    <w:lvl w:ilvl="8" w15:tentative="1">
+    <w:lvl w:ilvl="8" w:tentative="1">
       <w:start w:val="1"/>
       <w:numFmt w:val="bullet"/>
       <w:lvlText w:val="●"/>
@@ -7862,29 +8076,29 @@
   </w:abstractNum>
   <w:abstractNum w:abstractNumId="2" w15:restartNumberingAfterBreak="0">
     <w:multiLevelType w:val="hybridMultilevel"/>
-    <w:lvl w:ilvl="0" w15:tentative="1">
+    <w:lvl w:ilvl="0" w:tentative="1">
       <w:start w:val="1"/>
       <w:numFmt w:val="bullet"/>
       <w:lvlText w:val="•"/>
-      <w:lvlJc w:val="start"/>
+      <w:lvlJc w:val="left"/>
       <w:pPr>
         <w:ind w:left="400" w:hanging="240"/>
       </w:pPr>
     </w:lvl>
-    <w:lvl w:ilvl="1" w15:tentative="1">
+    <w:lvl w:ilvl="1" w:tentative="1">
       <w:start w:val="1"/>
       <w:numFmt w:val="bullet"/>
       <w:lvlText w:val="◦"/>
-      <w:lvlJc w:val="start"/>
+      <w:lvlJc w:val="left"/>
       <w:pPr>
         <w:ind w:left="800" w:hanging="240"/>
       </w:pPr>
     </w:lvl>
-    <w:lvl w:ilvl="2" w15:tentative="1">
+    <w:lvl w:ilvl="2" w:tentative="1">
       <w:start w:val="1"/>
       <w:numFmt w:val="bullet"/>
       <w:lvlText w:val="▪"/>
-      <w:lvlJc w:val="start"/>
+      <w:lvlJc w:val="left"/>
       <w:pPr>
         <w:ind w:left="1200" w:hanging="240"/>
       </w:pPr>
@@ -7892,29 +8106,29 @@
   </w:abstractNum>
   <w:abstractNum w:abstractNumId="3" w15:restartNumberingAfterBreak="0">
     <w:multiLevelType w:val="hybridMultilevel"/>
-    <w:lvl w:ilvl="0" w15:tentative="1">
+    <w:lvl w:ilvl="0" w:tentative="1">
       <w:start w:val="1"/>
       <w:numFmt w:val="decimal"/>
       <w:lvlText w:val="%1."/>
-      <w:lvlJc w:val="start"/>
+      <w:lvlJc w:val="left"/>
       <w:pPr>
         <w:ind w:left="420" w:hanging="260"/>
       </w:pPr>
     </w:lvl>
-    <w:lvl w:ilvl="1" w15:tentative="1">
+    <w:lvl w:ilvl="1" w:tentative="1">
       <w:start w:val="1"/>
       <w:numFmt w:val="decimal"/>
       <w:lvlText w:val="%2."/>
-      <w:lvlJc w:val="start"/>
+      <w:lvlJc w:val="left"/>
       <w:pPr>
         <w:ind w:left="840" w:hanging="260"/>
       </w:pPr>
     </w:lvl>
-    <w:lvl w:ilvl="2" w15:tentative="1">
+    <w:lvl w:ilvl="2" w:tentative="1">
       <w:start w:val="1"/>
       <w:numFmt w:val="decimal"/>
       <w:lvlText w:val="%3."/>
-      <w:lvlJc w:val="start"/>
+      <w:lvlJc w:val="left"/>
       <w:pPr>
         <w:ind w:left="1260" w:hanging="260"/>
       </w:pPr>
@@ -7929,6 +8143,12 @@
   <w:num w:numId="2">
     <w:abstractNumId w:val="3"/>
     <w:lvlOverride w:ilvl="0">
+      <w:startOverride w:val="1"/>
+    </w:lvlOverride>
+    <w:lvlOverride w:ilvl="1">
+      <w:startOverride w:val="1"/>
+    </w:lvlOverride>
+    <w:lvlOverride w:ilvl="2">
       <w:startOverride w:val="1"/>
     </w:lvlOverride>
   </w:num>
@@ -7948,6 +8168,25 @@
     </w:rPrDefault>
     <w:pPrDefault/>
   </w:docDefaults>
+  <w:style w:type="paragraph" w:styleId="Normal" w:default="1">
+    <w:name w:val="Normal"/>
+    <w:qFormat/>
+  </w:style>
+  <w:style w:type="table" w:styleId="TableNormal" w:default="true">
+    <w:name w:val="Normal Table"/>
+    <w:uiPriority w:val="99"/>
+    <w:semiHidden/>
+    <w:unhideWhenUsed/>
+    <w:tblPr>
+      <w:tblInd w:type="dxa" w:w="0"/>
+      <w:tblCellMar>
+        <w:top w:type="dxa" w:w="0"/>
+        <w:left w:type="dxa" w:w="108"/>
+        <w:bottom w:type="dxa" w:w="0"/>
+        <w:right w:type="dxa" w:w="108"/>
+      </w:tblCellMar>
+    </w:tblPr>
+  </w:style>
   <w:style w:type="paragraph" w:styleId="Title">
     <w:name w:val="Title"/>
     <w:basedOn w:val="Normal"/>
@@ -8120,4 +8359,294 @@
     </w:rPr>
   </w:style>
 </w:styles>
+</file>
+
+<file path=word/theme/theme1.xml><?xml version="1.0" encoding="utf-8"?>
+<a:theme xmlns:a="http://schemas.openxmlformats.org/drawingml/2006/main" name="Office Theme">
+  <a:themeElements>
+    <a:clrScheme name="Office">
+      <a:dk1>
+        <a:sysClr val="windowText" lastClr="000000"/>
+      </a:dk1>
+      <a:lt1>
+        <a:sysClr val="window" lastClr="FFFFFF"/>
+      </a:lt1>
+      <a:dk2>
+        <a:srgbClr val="44546A"/>
+      </a:dk2>
+      <a:lt2>
+        <a:srgbClr val="E7E6E6"/>
+      </a:lt2>
+      <a:accent1>
+        <a:srgbClr val="4472C4"/>
+      </a:accent1>
+      <a:accent2>
+        <a:srgbClr val="ED7D31"/>
+      </a:accent2>
+      <a:accent3>
+        <a:srgbClr val="A5A5A5"/>
+      </a:accent3>
+      <a:accent4>
+        <a:srgbClr val="FFC000"/>
+      </a:accent4>
+      <a:accent5>
+        <a:srgbClr val="5B9BD5"/>
+      </a:accent5>
+      <a:accent6>
+        <a:srgbClr val="70AD47"/>
+      </a:accent6>
+      <a:hlink>
+        <a:srgbClr val="0563C1"/>
+      </a:hlink>
+      <a:folHlink>
+        <a:srgbClr val="954F72"/>
+      </a:folHlink>
+    </a:clrScheme>
+    <a:fontScheme name="Office">
+      <a:majorFont>
+        <a:latin typeface="Calibri Light" panose="020F0302020204030204"/>
+        <a:ea typeface=""/>
+        <a:cs typeface=""/>
+        <a:font script="Jpan" typeface="游ゴシック Light"/>
+        <a:font script="Hang" typeface="맑은 고딕"/>
+        <a:font script="Hans" typeface="等线 Light"/>
+        <a:font script="Hant" typeface="新細明體"/>
+        <a:font script="Arab" typeface="Times New Roman"/>
+        <a:font script="Hebr" typeface="Times New Roman"/>
+        <a:font script="Thai" typeface="Angsana New"/>
+        <a:font script="Ethi" typeface="Nyala"/>
+        <a:font script="Beng" typeface="Vrinda"/>
+        <a:font script="Gujr" typeface="Shruti"/>
+        <a:font script="Khmr" typeface="MoolBoran"/>
+        <a:font script="Knda" typeface="Tunga"/>
+        <a:font script="Guru" typeface="Raavi"/>
+        <a:font script="Cans" typeface="Euphemia"/>
+        <a:font script="Cher" typeface="Plantagenet Cherokee"/>
+        <a:font script="Yiii" typeface="Microsoft Yi Baiti"/>
+        <a:font script="Tibt" typeface="Microsoft Himalaya"/>
+        <a:font script="Thaa" typeface="MV Boli"/>
+        <a:font script="Deva" typeface="Mangal"/>
+        <a:font script="Telu" typeface="Gautami"/>
+        <a:font script="Taml" typeface="Latha"/>
+        <a:font script="Syrc" typeface="Estrangelo Edessa"/>
+        <a:font script="Orya" typeface="Kalinga"/>
+        <a:font script="Mlym" typeface="Kartika"/>
+        <a:font script="Laoo" typeface="DokChampa"/>
+        <a:font script="Sinh" typeface="Iskoola Pota"/>
+        <a:font script="Mong" typeface="Mongolian Baiti"/>
+        <a:font script="Viet" typeface="Times New Roman"/>
+        <a:font script="Uigh" typeface="Microsoft Uighur"/>
+        <a:font script="Geor" typeface="Sylfaen"/>
+        <a:font script="Armn" typeface="Arial"/>
+        <a:font script="Bugi" typeface="Leelawadee UI"/>
+        <a:font script="Bopo" typeface="Microsoft JhengHei"/>
+        <a:font script="Java" typeface="Javanese Text"/>
+        <a:font script="Lisu" typeface="Segoe UI"/>
+        <a:font script="Mymr" typeface="Myanmar Text"/>
+        <a:font script="Nkoo" typeface="Ebrima"/>
+        <a:font script="Olck" typeface="Nirmala UI"/>
+        <a:font script="Osma" typeface="Ebrima"/>
+        <a:font script="Phag" typeface="Phagspa"/>
+        <a:font script="Syrn" typeface="Estrangelo Edessa"/>
+        <a:font script="Syrj" typeface="Estrangelo Edessa"/>
+        <a:font script="Syre" typeface="Estrangelo Edessa"/>
+        <a:font script="Sora" typeface="Nirmala UI"/>
+        <a:font script="Tale" typeface="Microsoft Tai Le"/>
+        <a:font script="Talu" typeface="Microsoft New Tai Lue"/>
+        <a:font script="Tfng" typeface="Ebrima"/>
+      </a:majorFont>
+      <a:minorFont>
+        <a:latin typeface="Calibri" panose="020F0502020204030204"/>
+        <a:ea typeface=""/>
+        <a:cs typeface=""/>
+        <a:font script="Jpan" typeface="游明朝"/>
+        <a:font script="Hang" typeface="맑은 고딕"/>
+        <a:font script="Hans" typeface="等线"/>
+        <a:font script="Hant" typeface="新細明體"/>
+        <a:font script="Arab" typeface="Arial"/>
+        <a:font script="Hebr" typeface="Arial"/>
+        <a:font script="Thai" typeface="Cordia New"/>
+        <a:font script="Ethi" typeface="Nyala"/>
+        <a:font script="Beng" typeface="Vrinda"/>
+        <a:font script="Gujr" typeface="Shruti"/>
+        <a:font script="Khmr" typeface="DaunPenh"/>
+        <a:font script="Knda" typeface="Tunga"/>
+        <a:font script="Guru" typeface="Raavi"/>
+        <a:font script="Cans" typeface="Euphemia"/>
+        <a:font script="Cher" typeface="Plantagenet Cherokee"/>
+        <a:font script="Yiii" typeface="Microsoft Yi Baiti"/>
+        <a:font script="Tibt" typeface="Microsoft Himalaya"/>
+        <a:font script="Thaa" typeface="MV Boli"/>
+        <a:font script="Deva" typeface="Mangal"/>
+        <a:font script="Telu" typeface="Gautami"/>
+        <a:font script="Taml" typeface="Latha"/>
+        <a:font script="Syrc" typeface="Estrangelo Edessa"/>
+        <a:font script="Orya" typeface="Kalinga"/>
+        <a:font script="Mlym" typeface="Kartika"/>
+        <a:font script="Laoo" typeface="DokChampa"/>
+        <a:font script="Sinh" typeface="Iskoola Pota"/>
+        <a:font script="Mong" typeface="Mongolian Baiti"/>
+        <a:font script="Viet" typeface="Arial"/>
+        <a:font script="Uigh" typeface="Microsoft Uighur"/>
+        <a:font script="Geor" typeface="Sylfaen"/>
+        <a:font script="Armn" typeface="Arial"/>
+        <a:font script="Bugi" typeface="Leelawadee UI"/>
+        <a:font script="Bopo" typeface="Microsoft JhengHei"/>
+        <a:font script="Java" typeface="Javanese Text"/>
+        <a:font script="Lisu" typeface="Segoe UI"/>
+        <a:font script="Mymr" typeface="Myanmar Text"/>
+        <a:font script="Nkoo" typeface="Ebrima"/>
+        <a:font script="Olck" typeface="Nirmala UI"/>
+        <a:font script="Osma" typeface="Ebrima"/>
+        <a:font script="Phag" typeface="Phagspa"/>
+        <a:font script="Syrn" typeface="Estrangelo Edessa"/>
+        <a:font script="Syrj" typeface="Estrangelo Edessa"/>
+        <a:font script="Syre" typeface="Estrangelo Edessa"/>
+        <a:font script="Sora" typeface="Nirmala UI"/>
+        <a:font script="Tale" typeface="Microsoft Tai Le"/>
+        <a:font script="Talu" typeface="Microsoft New Tai Lue"/>
+        <a:font script="Tfng" typeface="Ebrima"/>
+      </a:minorFont>
+    </a:fontScheme>
+    <a:fmtScheme name="Office">
+      <a:fillStyleLst>
+        <a:solidFill>
+          <a:schemeClr val="phClr"/>
+        </a:solidFill>
+        <a:gradFill rotWithShape="true">
+          <a:gsLst>
+            <a:gs pos="0">
+              <a:schemeClr val="phClr">
+                <a:lumMod val="110000"/>
+                <a:satMod val="105000"/>
+                <a:tint val="67000"/>
+              </a:schemeClr>
+            </a:gs>
+            <a:gs pos="50000">
+              <a:schemeClr val="phClr">
+                <a:lumMod val="105000"/>
+                <a:satMod val="103000"/>
+                <a:tint val="73000"/>
+              </a:schemeClr>
+            </a:gs>
+            <a:gs pos="100000">
+              <a:schemeClr val="phClr">
+                <a:lumMod val="105000"/>
+                <a:satMod val="109000"/>
+                <a:tint val="81000"/>
+              </a:schemeClr>
+            </a:gs>
+          </a:gsLst>
+          <a:lin ang="5400000" scaled="false"/>
+        </a:gradFill>
+        <a:gradFill rotWithShape="true">
+          <a:gsLst>
+            <a:gs pos="0">
+              <a:schemeClr val="phClr">
+                <a:satMod val="103000"/>
+                <a:lumMod val="102000"/>
+                <a:tint val="94000"/>
+              </a:schemeClr>
+            </a:gs>
+            <a:gs pos="50000">
+              <a:schemeClr val="phClr">
+                <a:satMod val="110000"/>
+                <a:lumMod val="100000"/>
+                <a:shade val="100000"/>
+              </a:schemeClr>
+            </a:gs>
+            <a:gs pos="100000">
+              <a:schemeClr val="phClr">
+                <a:lumMod val="99000"/>
+                <a:satMod val="120000"/>
+                <a:shade val="78000"/>
+              </a:schemeClr>
+            </a:gs>
+          </a:gsLst>
+          <a:lin ang="5400000" scaled="false"/>
+        </a:gradFill>
+      </a:fillStyleLst>
+      <a:lnStyleLst>
+        <a:ln w="6350" cap="flat" cmpd="sng" algn="ctr">
+          <a:solidFill>
+            <a:schemeClr val="phClr"/>
+          </a:solidFill>
+          <a:prstDash val="solid"/>
+          <a:miter lim="800000"/>
+        </a:ln>
+        <a:ln w="12700" cap="flat" cmpd="sng" algn="ctr">
+          <a:solidFill>
+            <a:schemeClr val="phClr"/>
+          </a:solidFill>
+          <a:prstDash val="solid"/>
+          <a:miter lim="800000"/>
+        </a:ln>
+        <a:ln w="19050" cap="flat" cmpd="sng" algn="ctr">
+          <a:solidFill>
+            <a:schemeClr val="phClr"/>
+          </a:solidFill>
+          <a:prstDash val="solid"/>
+          <a:miter lim="800000"/>
+        </a:ln>
+      </a:lnStyleLst>
+      <a:effectStyleLst>
+        <a:effectStyle>
+          <a:effectLst/>
+        </a:effectStyle>
+        <a:effectStyle>
+          <a:effectLst/>
+        </a:effectStyle>
+        <a:effectStyle>
+          <a:effectLst>
+            <a:outerShdw blurRad="57150" dist="19050" dir="5400000" algn="ctr" rotWithShape="false">
+              <a:srgbClr val="000000">
+                <a:alpha val="63000"/>
+              </a:srgbClr>
+            </a:outerShdw>
+          </a:effectLst>
+        </a:effectStyle>
+      </a:effectStyleLst>
+      <a:bgFillStyleLst>
+        <a:solidFill>
+          <a:schemeClr val="phClr"/>
+        </a:solidFill>
+        <a:solidFill>
+          <a:schemeClr val="phClr">
+            <a:tint val="95000"/>
+            <a:satMod val="170000"/>
+          </a:schemeClr>
+        </a:solidFill>
+        <a:gradFill rotWithShape="true">
+          <a:gsLst>
+            <a:gs pos="0">
+              <a:schemeClr val="phClr">
+                <a:tint val="93000"/>
+                <a:satMod val="150000"/>
+                <a:shade val="98000"/>
+                <a:lumMod val="102000"/>
+              </a:schemeClr>
+            </a:gs>
+            <a:gs pos="50000">
+              <a:schemeClr val="phClr">
+                <a:tint val="98000"/>
+                <a:satMod val="130000"/>
+                <a:shade val="90000"/>
+                <a:lumMod val="103000"/>
+              </a:schemeClr>
+            </a:gs>
+            <a:gs pos="100000">
+              <a:schemeClr val="phClr">
+                <a:shade val="63000"/>
+                <a:satMod val="120000"/>
+              </a:schemeClr>
+            </a:gs>
+          </a:gsLst>
+          <a:lin ang="5400000" scaled="false"/>
+        </a:gradFill>
+      </a:bgFillStyleLst>
+    </a:fmtScheme>
+  </a:themeElements>
+  <a:objectDefaults/>
+  <a:extraClrSchemeLst/>
+</a:theme>
 </file>
</xml_diff>

<commit_message>
Add the project number from the register
A ProjectNumber column in the project register (aliases ProjectNo,
JobNumber and the like, and listed under Match the register columns) is
now read with each project and shown:

- on the projects page, above each project's name, and searchable;
- in the project dashboard's header;
- on the cover sheet as a Project number field, filled from the
  register (tagged auto) and editable;
- on the letter, as a Project Number line directly under Project.

It is saved with the variation and sent to the log write as
projectNumber, for an optional ProjectNumber column. Optional: a project
without one shows nothing and is never reported as missing.

Docs: the register column, the Get projects Select line and the optional
log column. The register workbook and CSV gain the column.

Co-Authored-By: Claude Opus 5.5 <noreply@anthropic.com>
Claude-Session: https://claude.ai/code/session_0179JD8tKBuQw572uHNzHE2b
</commit_message>
<xml_diff>
--- a/docs/word/2 - The Two Registers.docx
+++ b/docs/word/2 - The Two Registers.docx
@@ -2428,6 +2428,172 @@
                 <w:szCs w:val="18"/>
               </w:rPr>
               <w:t xml:space="preserve"> This is the dropdown label and the Project row of the letter</w:t>
+            </w:r>
+          </w:p>
+        </w:tc>
+      </w:tr>
+      <w:tr>
+        <w:tc>
+          <w:tcPr>
+            <w:tcW w:type="dxa" w:w="1096"/>
+            <w:shd w:fill="FFFFFF" w:val="clear"/>
+            <w:tcMar>
+              <w:top w:type="dxa" w:w="60"/>
+              <w:left w:type="dxa" w:w="110"/>
+              <w:bottom w:type="dxa" w:w="60"/>
+              <w:right w:type="dxa" w:w="110"/>
+            </w:tcMar>
+          </w:tcPr>
+          <w:p>
+            <w:pPr>
+              <w:spacing w:after="0" w:before="0"/>
+            </w:pPr>
+            <w:r>
+              <w:rPr>
+                <w:rFonts w:ascii="Arial" w:cs="Arial" w:eastAsia="Arial" w:hAnsi="Arial"/>
+                <w:color w:val="1C2B3A"/>
+                <w:sz w:val="18"/>
+                <w:szCs w:val="18"/>
+              </w:rPr>
+              <w:t xml:space="preserve">Project Number</w:t>
+            </w:r>
+          </w:p>
+        </w:tc>
+        <w:tc>
+          <w:tcPr>
+            <w:tcW w:type="dxa" w:w="1160"/>
+            <w:shd w:fill="FFFFFF" w:val="clear"/>
+            <w:tcMar>
+              <w:top w:type="dxa" w:w="60"/>
+              <w:left w:type="dxa" w:w="110"/>
+              <w:bottom w:type="dxa" w:w="60"/>
+              <w:right w:type="dxa" w:w="110"/>
+            </w:tcMar>
+          </w:tcPr>
+          <w:p>
+            <w:pPr>
+              <w:spacing w:after="0" w:before="0"/>
+            </w:pPr>
+            <w:r>
+              <w:rPr>
+                <w:rFonts w:ascii="Consolas" w:cs="Consolas" w:eastAsia="Consolas" w:hAnsi="Consolas"/>
+                <w:color w:val="2A4258"/>
+                <w:sz w:val="16"/>
+                <w:szCs w:val="16"/>
+                <w:shd w:fill="F2F0EA" w:val="clear"/>
+              </w:rPr>
+              <w:t xml:space="preserve">ProjectNumber</w:t>
+            </w:r>
+          </w:p>
+        </w:tc>
+        <w:tc>
+          <w:tcPr>
+            <w:tcW w:type="dxa" w:w="2901"/>
+            <w:shd w:fill="FFFFFF" w:val="clear"/>
+            <w:tcMar>
+              <w:top w:type="dxa" w:w="60"/>
+              <w:left w:type="dxa" w:w="110"/>
+              <w:bottom w:type="dxa" w:w="60"/>
+              <w:right w:type="dxa" w:w="110"/>
+            </w:tcMar>
+          </w:tcPr>
+          <w:p>
+            <w:pPr>
+              <w:spacing w:after="0" w:before="0"/>
+            </w:pPr>
+            <w:r>
+              <w:rPr>
+                <w:rFonts w:ascii="Arial" w:cs="Arial" w:eastAsia="Arial" w:hAnsi="Arial"/>
+                <w:color w:val="1C2B3A"/>
+                <w:sz w:val="18"/>
+                <w:szCs w:val="18"/>
+              </w:rPr>
+              <w:t xml:space="preserve">Single line of text</w:t>
+            </w:r>
+          </w:p>
+        </w:tc>
+        <w:tc>
+          <w:tcPr>
+            <w:tcW w:type="dxa" w:w="3869"/>
+            <w:shd w:fill="FFFFFF" w:val="clear"/>
+            <w:tcMar>
+              <w:top w:type="dxa" w:w="60"/>
+              <w:left w:type="dxa" w:w="110"/>
+              <w:bottom w:type="dxa" w:w="60"/>
+              <w:right w:type="dxa" w:w="110"/>
+            </w:tcMar>
+          </w:tcPr>
+          <w:p>
+            <w:pPr>
+              <w:spacing w:after="0" w:before="0"/>
+            </w:pPr>
+            <w:r>
+              <w:rPr>
+                <w:rFonts w:ascii="Arial" w:cs="Arial" w:eastAsia="Arial" w:hAnsi="Arial"/>
+                <w:color w:val="1C2B3A"/>
+                <w:sz w:val="18"/>
+                <w:szCs w:val="18"/>
+              </w:rPr>
+              <w:t xml:space="preserve">Optional. The project's number (e.g. </w:t>
+            </w:r>
+            <w:r>
+              <w:rPr>
+                <w:rFonts w:ascii="Consolas" w:cs="Consolas" w:eastAsia="Consolas" w:hAnsi="Consolas"/>
+                <w:color w:val="2A4258"/>
+                <w:sz w:val="16"/>
+                <w:szCs w:val="16"/>
+                <w:shd w:fill="F2F0EA" w:val="clear"/>
+              </w:rPr>
+              <w:t xml:space="preserve">1507V</w:t>
+            </w:r>
+            <w:r>
+              <w:rPr>
+                <w:rFonts w:ascii="Arial" w:cs="Arial" w:eastAsia="Arial" w:hAnsi="Arial"/>
+                <w:color w:val="1C2B3A"/>
+                <w:sz w:val="18"/>
+                <w:szCs w:val="18"/>
+              </w:rPr>
+              <w:t xml:space="preserve">). Shown on the projects page and the project's dashboard, fills </w:t>
+            </w:r>
+            <w:r>
+              <w:rPr>
+                <w:rFonts w:ascii="Arial" w:cs="Arial" w:eastAsia="Arial" w:hAnsi="Arial"/>
+                <w:i/>
+                <w:iCs/>
+                <w:color w:val="1C2B3A"/>
+                <w:sz w:val="18"/>
+                <w:szCs w:val="18"/>
+              </w:rPr>
+              <w:t xml:space="preserve">Project number</w:t>
+            </w:r>
+            <w:r>
+              <w:rPr>
+                <w:rFonts w:ascii="Arial" w:cs="Arial" w:eastAsia="Arial" w:hAnsi="Arial"/>
+                <w:color w:val="1C2B3A"/>
+                <w:sz w:val="18"/>
+                <w:szCs w:val="18"/>
+              </w:rPr>
+              <w:t xml:space="preserve"> on the cover sheet, and prints as the </w:t>
+            </w:r>
+            <w:r>
+              <w:rPr>
+                <w:rFonts w:ascii="Arial" w:cs="Arial" w:eastAsia="Arial" w:hAnsi="Arial"/>
+                <w:b/>
+                <w:bCs/>
+                <w:color w:val="1C2B3A"/>
+                <w:sz w:val="18"/>
+                <w:szCs w:val="18"/>
+              </w:rPr>
+              <w:t xml:space="preserve">Project Number</w:t>
+            </w:r>
+            <w:r>
+              <w:rPr>
+                <w:rFonts w:ascii="Arial" w:cs="Arial" w:eastAsia="Arial" w:hAnsi="Arial"/>
+                <w:color w:val="1C2B3A"/>
+                <w:sz w:val="18"/>
+                <w:szCs w:val="18"/>
+              </w:rPr>
+              <w:t xml:space="preserve"> line under Project on the letter</w:t>
             </w:r>
           </w:p>
         </w:tc>

</xml_diff>